<commit_message>
Sprint 2: Excel chart instead of Python, fewer sources, simpler AVG table
Co-Authored-By: Claude Fable 5.1 <noreply@anthropic.com>
Claude-Session: https://claude.ai/code/session_01G4Ddwh7uTVc2EA5q2vaUJ2
</commit_message>
<xml_diff>
--- a/datalab-sprint2/Datalab1_Sprint2_Reflectie_en_GenAI_evaluatie_Groep3.docx
+++ b/datalab-sprint2/Datalab1_Sprint2_Reflectie_en_GenAI_evaluatie_Groep3.docx
@@ -300,7 +300,7 @@
         <w:t xml:space="preserve">Situatie.</w:t>
       </w:r>
       <w:r>
-        <w:t xml:space="preserve"> In sprint 2 moesten we als consultant de Nederlandse energiemarkt onderzoeken: een groter rapport met veel bronnen, een grafiek in Python, een CRAAP-beoordeling van elke bron, een samenwerkingsovereenkomst en deze reflectie.</w:t>
+        <w:t xml:space="preserve"> In sprint 2 moesten we als consultant de Nederlandse energiemarkt onderzoeken: een groter rapport met veel bronnen, een grafiek in Excel, een CRAAP-beoordeling van elke bron, een samenwerkingsovereenkomst en deze reflectie.</w:t>
       </w:r>
     </w:p>
     <w:p>
@@ -324,7 +324,7 @@
         <w:t xml:space="preserve">Actie.</w:t>
       </w:r>
       <w:r>
-        <w:t xml:space="preserve"> We zijn gestart met de samenwerkingsovereenkomst, waarin we de afspraken uit sprint 1 concreet hebben gemaakt: een vast wekelijks overleg op maandag, een gedeelde bronnenlijst waarin elke bron direct met APA-vermelding en CRAAP-score wordt toegevoegd, en de regel dat elk hoofdstuk door een ander groepslid wordt nagelezen voordat het definitief is. De taken hebben we verdeeld op basis van ieders expertise: Jemairo de dataset en de grafiek, Mohamed de opmaak en hoofdstuk 4, Redouan de code en het advies, Joshua de marktbeschrijving, de conclusies en de bronnen.</w:t>
+        <w:t xml:space="preserve"> We zijn gestart met de samenwerkingsovereenkomst, waarin we de afspraken uit sprint 1 concreet hebben gemaakt: een vast wekelijks overleg op maandag, een gedeelde bronnenlijst waarin elke bron direct met APA-vermelding en CRAAP-score wordt toegevoegd, en de regel dat elk hoofdstuk door een ander groepslid wordt nagelezen voordat het definitief is. De taken hebben we verdeeld op basis van ieders expertise: Jemairo de dataset en de Excel-grafiek, Mohamed de opmaak en hoofdstuk 4, Redouan de code en het advies, Joshua de marktbeschrijving, de conclusies en de bronnen.</w:t>
       </w:r>
     </w:p>
     <w:p>
@@ -1202,7 +1202,7 @@
                 <w:sz w:val="17"/>
                 <w:szCs w:val="17"/>
               </w:rPr>
-              <w:t xml:space="preserve">Jemairo heeft de CBS-dataset gevonden en de grafiek in Python gemaakt, inclusief het uitzoeken van de methodewijziging van het CBS in november 2022. Hij werkt nauwkeurig en legt goed uit wat hij heeft gedaan.</w:t>
+              <w:t xml:space="preserve">Jemairo heeft de CBS-dataset gevonden en de grafieken in Excel gemaakt, inclusief het uitzoeken van de methodewijziging van het CBS in november 2022. Hij werkt nauwkeurig en legt goed uit wat hij heeft gedaan.</w:t>
             </w:r>
           </w:p>
         </w:tc>
@@ -1800,7 +1800,7 @@
                 <w:sz w:val="18"/>
                 <w:szCs w:val="18"/>
               </w:rPr>
-              <w:t xml:space="preserve">Hulp bij Python-code (matplotlib-opmaak, twee panelen met eigen as) en bij het oplossen van foutmeldingen</w:t>
+              <w:t xml:space="preserve">Hulp bij Excel (welke grafiek past bij de data, hoe je een as een titel geeft) en bij het begrijpen van de CBS-tabel</w:t>
             </w:r>
           </w:p>
         </w:tc>
@@ -1945,10 +1945,10 @@
           <w:b/>
           <w:bCs/>
         </w:rPr>
-        <w:t xml:space="preserve">Betere code.</w:t>
-      </w:r>
-      <w:r>
-        <w:t xml:space="preserve"> De grafiek in hoofdstuk 3 heeft twee panelen met elk een eigen as, directe labels bij begin, piek en eind en verticale lijnen voor de gebeurtenissen van 2022. Die opzet hebben we met hulp van GenAI gebouwd; de data zijn handmatig uit StatLine overgenomen en door twee groepsleden gecontroleerd.</w:t>
+        <w:t xml:space="preserve">Betere grafiek.</w:t>
+      </w:r>
+      <w:r>
+        <w:t xml:space="preserve"> We twijfelden of gas en stroom in één grafiek konden; GenAI legde uit waarom twee aparte grafieken met een eigen as eerlijker zijn. De data zijn handmatig uit StatLine overgenomen en door twee groepsleden gecontroleerd.</w:t>
       </w:r>
     </w:p>
     <w:p>
@@ -2006,7 +2006,7 @@
         <w:t xml:space="preserve">Wat werkte:</w:t>
       </w:r>
       <w:r>
-        <w:t xml:space="preserve"> GenAI als 'sparringpartner' en als redacteur van onze eigen tekst. Ook het laten uitleggen van foutmeldingen in Python scheelde veel tijd.</w:t>
+        <w:t xml:space="preserve"> GenAI als 'sparringpartner' en als redacteur van onze eigen tekst. Ook het laten uitleggen van de kolommen in de CBS-tabel scheelde veel tijd.</w:t>
       </w:r>
     </w:p>
     <w:p>
@@ -2550,7 +2550,7 @@
                 <w:sz w:val="17"/>
                 <w:szCs w:val="17"/>
               </w:rPr>
-              <w:t xml:space="preserve">Code begrijpen</w:t>
+              <w:t xml:space="preserve">Analyse begrijpen</w:t>
             </w:r>
           </w:p>
         </w:tc>
@@ -2577,7 +2577,7 @@
                 <w:sz w:val="17"/>
                 <w:szCs w:val="17"/>
               </w:rPr>
-              <w:t xml:space="preserve">Code die met GenAI is gemaakt wordt door een ander groepslid uitgelegd in het overleg voordat we die gebruiken (anders begrijpen we onze eigen analyse niet)</w:t>
+              <w:t xml:space="preserve">Een grafiek of analyse die met hulp van GenAI is gemaakt wordt door een ander groepslid uitgelegd in het overleg voordat we die gebruiken (anders begrijpen we onze eigen analyse niet)</w:t>
             </w:r>
           </w:p>
         </w:tc>
@@ -2771,7 +2771,7 @@
     </w:p>
     <w:p>
       <w:r>
-        <w:t xml:space="preserve">De samenwerking in onze groep is in sprint 2 duidelijk beter geworden dan in sprint 1. De inzet was in beide sprints goed, maar in sprint 2 hebben we onze afspraken concreet gemaakt en elkaars werk tussentijds gecontroleerd, waardoor fouten eerder werden gevonden. Het grootste verbeterpunt blijft planning: grote taken moeten eerder worden gesplitst en interne deadlines beter bewaakt. GenAI heeft ons geholpen om sneller goede bronnen te vinden, betere code te schrijven en leesbaarder te schrijven, maar heeft ons ook geleerd dat elk feit zelf gecontroleerd moet worden. Met de actiepunten uit paragraaf 2.4 en 4.4 gaan we sprint 3 in.</w:t>
+        <w:t xml:space="preserve">De samenwerking in onze groep is in sprint 2 duidelijk beter geworden dan in sprint 1. De inzet was in beide sprints goed, maar in sprint 2 hebben we onze afspraken concreet gemaakt en elkaars werk tussentijds gecontroleerd, waardoor fouten eerder werden gevonden. Het grootste verbeterpunt blijft planning: grote taken moeten eerder worden gesplitst en interne deadlines beter bewaakt. GenAI heeft ons geholpen om sneller goede bronnen te vinden, een betere grafiek te maken en leesbaarder te schrijven, maar heeft ons ook geleerd dat elk feit zelf gecontroleerd moet worden. Met de actiepunten uit paragraaf 2.4 en 4.4 gaan we sprint 3 in.</w:t>
       </w:r>
     </w:p>
     <w:sectPr>

</xml_diff>